<commit_message>
feat: add new dashboard and data analysis files; update documentation to include new metrics and validation analysis for the Índice de Representação Substantiva (IRS)
</commit_message>
<xml_diff>
--- a/docs/main.docx
+++ b/docs/main.docx
@@ -5075,13 +5075,13 @@
     <w:bookmarkEnd w:id="36"/>
     <w:bookmarkEnd w:id="37"/>
     <w:bookmarkEnd w:id="38"/>
-    <w:bookmarkStart w:id="39" w:name="índice-de-representação-substantiva-irs"/>
+    <w:bookmarkStart w:id="49" w:name="X7b493bdb8b48bb764b4bfe9ee611b50a48d86bb"/>
     <w:p>
       <w:pPr>
         <w:pStyle w:val="Heading1"/>
       </w:pPr>
       <w:r>
-        <w:t xml:space="preserve">Índice de Representação Substantiva (IRS)</w:t>
+        <w:t xml:space="preserve">Dimensão Representação Substantiva (Coesão Representativa Individual)</w:t>
       </w:r>
     </w:p>
     <w:p>
@@ -5121,9 +5121,18 @@
         <w:t xml:space="preserve">) na defesa e ação concreta de determinadas pautas. Assim, preocupação de maior magnitude é entender como eles se reivindicam representantes de determinados grupos ou valores. Propomos, assim, a construção de um índice que mensure, individualmente, os níveis de coesão das pautas defendidas por cada deputado em suas páginas nas redes sociais, especificamente o Instagram.</w:t>
       </w:r>
     </w:p>
-    <w:p>
-      <w:pPr>
-        <w:pStyle w:val="BodyText"/>
+    <w:bookmarkStart w:id="39" w:name="cálculo-do-índice"/>
+    <w:p>
+      <w:pPr>
+        <w:pStyle w:val="Heading2"/>
+      </w:pPr>
+      <w:r>
+        <w:t xml:space="preserve">Cálculo do Índice</w:t>
+      </w:r>
+    </w:p>
+    <w:p>
+      <w:pPr>
+        <w:pStyle w:val="FirstParagraph"/>
       </w:pPr>
       <w:r>
         <w:t xml:space="preserve">Para isso, extraímos os textos de 306.680 postagens de 495 perfis de deputados federais da 57ª Legislatura, em 2023. Optamos por um ano não eleitoral, por acreditarmos que a proximidade com o pleito poderia enviesar o conteúdo das postagens feitas pelos deputados. A fim de excluir postagens nas quais os deputados não buscavam representar seus eleitorados, os textos foram tratados e filtrados a partir da presença de determinados conjuntos de termos. Nesse sentido, incluímos em nosso universo de análise, apenas as postagens nas quais haviam termos que I) referenciam determinados grupos sociais (população, mulheres, brasileiros, pobres, médicos, etc.) e II) mobilizam alguma relação de representação política (lutar, representar, defender, etc.).</w:t>
@@ -5428,18 +5437,9 @@
           <m:r>
             <m:t>R</m:t>
           </m:r>
-          <m:sSub>
-            <m:e>
-              <m:r>
-                <m:t>C</m:t>
-              </m:r>
-            </m:e>
-            <m:sub>
-              <m:r>
-                <m:t>x</m:t>
-              </m:r>
-            </m:sub>
-          </m:sSub>
+          <m:r>
+            <m:t>S</m:t>
+          </m:r>
           <m:r>
             <m:rPr>
               <m:sty m:val="p"/>
@@ -5507,18 +5507,9 @@
         <m:r>
           <m:t>R</m:t>
         </m:r>
-        <m:sSub>
-          <m:e>
-            <m:r>
-              <m:t>C</m:t>
-            </m:r>
-          </m:e>
-          <m:sub>
-            <m:r>
-              <m:t>x</m:t>
-            </m:r>
-          </m:sub>
-        </m:sSub>
+        <m:r>
+          <m:t>S</m:t>
+        </m:r>
       </m:oMath>
       <w:r>
         <w:t xml:space="preserve">: Representative Cohesion Index;</w:t>
@@ -5556,7 +5547,337 @@
       </w:r>
     </w:p>
     <w:bookmarkEnd w:id="39"/>
-    <w:bookmarkStart w:id="42" w:name="índice-de-falar-sincero-ifs"/>
+    <w:bookmarkStart w:id="48" w:name="validação-e-análise-do-irs"/>
+    <w:p>
+      <w:pPr>
+        <w:pStyle w:val="Heading2"/>
+      </w:pPr>
+      <w:r>
+        <w:t xml:space="preserve">Validação e Análise do IRS</w:t>
+      </w:r>
+    </w:p>
+    <w:p>
+      <w:pPr>
+        <w:pStyle w:val="FirstParagraph"/>
+      </w:pPr>
+      <w:r>
+        <w:t xml:space="preserve">A medida encontra problemas de escala e comparabilidade. A construção do Índice de Qualidade da Representação (IQR) agrega quatro dimensões padronizadas no intervalo</w:t>
+      </w:r>
+      <w:r>
+        <w:t xml:space="preserve"> </w:t>
+      </w:r>
+      <m:oMath>
+        <m:r>
+          <m:rPr>
+            <m:sty m:val="p"/>
+          </m:rPr>
+          <m:t>[</m:t>
+        </m:r>
+        <m:r>
+          <m:t>0</m:t>
+        </m:r>
+        <m:r>
+          <m:rPr>
+            <m:sty m:val="p"/>
+          </m:rPr>
+          <m:t>,</m:t>
+        </m:r>
+        <m:r>
+          <m:t>1</m:t>
+        </m:r>
+        <m:r>
+          <m:rPr>
+            <m:sty m:val="p"/>
+          </m:rPr>
+          <m:t>]</m:t>
+        </m:r>
+      </m:oMath>
+      <w:r>
+        <w:t xml:space="preserve">. No entanto, a dimensão Representação apresentou distribuição extremamente concentrada próxima de zero, com médias próximas a 0,1 (Figura</w:t>
+      </w:r>
+      <w:r>
+        <w:t xml:space="preserve"> </w:t>
+      </w:r>
+      <w:hyperlink w:anchor="fig:irs_mean_distribution">
+        <w:r>
+          <w:rPr>
+            <w:rStyle w:val="Hyperlink"/>
+          </w:rPr>
+          <w:t xml:space="preserve">5</w:t>
+        </w:r>
+      </w:hyperlink>
+      <w:r>
+        <w:t xml:space="preserve">) e mediana</w:t>
+      </w:r>
+      <w:r>
+        <w:t xml:space="preserve"> </w:t>
+      </w:r>
+      <m:oMath>
+        <m:r>
+          <m:rPr>
+            <m:sty m:val="p"/>
+          </m:rPr>
+          <m:t>≈</m:t>
+        </m:r>
+        <m:r>
+          <m:t>0</m:t>
+        </m:r>
+        <m:r>
+          <m:rPr>
+            <m:sty m:val="p"/>
+          </m:rPr>
+          <m:t>,</m:t>
+        </m:r>
+        <m:r>
+          <m:t>01</m:t>
+        </m:r>
+      </m:oMath>
+      <w:r>
+        <w:t xml:space="preserve"> </w:t>
+      </w:r>
+      <w:r>
+        <w:t xml:space="preserve">(Figura</w:t>
+      </w:r>
+      <w:r>
+        <w:t xml:space="preserve"> </w:t>
+      </w:r>
+      <w:hyperlink w:anchor="fig:irs_median_distribution">
+        <w:r>
+          <w:rPr>
+            <w:rStyle w:val="Hyperlink"/>
+          </w:rPr>
+          <w:t xml:space="preserve">6</w:t>
+        </w:r>
+      </w:hyperlink>
+      <w:r>
+        <w:t xml:space="preserve">), enquanto as demais dimensões exibem medidas centrais mais elevadas (Profissionalização</w:t>
+      </w:r>
+      <w:r>
+        <w:t xml:space="preserve"> </w:t>
+      </w:r>
+      <m:oMath>
+        <m:r>
+          <m:rPr>
+            <m:sty m:val="p"/>
+          </m:rPr>
+          <m:t>≈</m:t>
+        </m:r>
+        <m:r>
+          <m:t>0</m:t>
+        </m:r>
+        <m:r>
+          <m:rPr>
+            <m:sty m:val="p"/>
+          </m:rPr>
+          <m:t>,</m:t>
+        </m:r>
+        <m:r>
+          <m:t>28</m:t>
+        </m:r>
+      </m:oMath>
+      <w:r>
+        <w:t xml:space="preserve">; Representação Descritiva</w:t>
+      </w:r>
+      <w:r>
+        <w:t xml:space="preserve"> </w:t>
+      </w:r>
+      <m:oMath>
+        <m:r>
+          <m:rPr>
+            <m:sty m:val="p"/>
+          </m:rPr>
+          <m:t>≈</m:t>
+        </m:r>
+        <m:r>
+          <m:t>0</m:t>
+        </m:r>
+        <m:r>
+          <m:rPr>
+            <m:sty m:val="p"/>
+          </m:rPr>
+          <m:t>,</m:t>
+        </m:r>
+        <m:r>
+          <m:t>48</m:t>
+        </m:r>
+      </m:oMath>
+      <w:r>
+        <w:t xml:space="preserve">). Esse desalinhamento, sob agregação por média simples, a RS tenha peso efetivo muito reduzido no IQR, ainda que capture um atributo substantivo distinto. Do ponto de vista estatístico, o problema não é a validade do construto RS, mas a assimetria e compressão da sua distribuição em</w:t>
+      </w:r>
+      <w:r>
+        <w:t xml:space="preserve"> </w:t>
+      </w:r>
+      <m:oMath>
+        <m:r>
+          <m:rPr>
+            <m:sty m:val="p"/>
+          </m:rPr>
+          <m:t>[</m:t>
+        </m:r>
+        <m:r>
+          <m:t>0</m:t>
+        </m:r>
+        <m:r>
+          <m:rPr>
+            <m:sty m:val="p"/>
+          </m:rPr>
+          <m:t>,</m:t>
+        </m:r>
+        <m:r>
+          <m:t>1</m:t>
+        </m:r>
+        <m:r>
+          <m:rPr>
+            <m:sty m:val="p"/>
+          </m:rPr>
+          <m:t>]</m:t>
+        </m:r>
+      </m:oMath>
+      <w:r>
+        <w:t xml:space="preserve">.</w:t>
+      </w:r>
+    </w:p>
+    <w:bookmarkStart w:id="43" w:name="fig:irs_mean_distribution"/>
+    <w:p>
+      <w:pPr>
+        <w:pStyle w:val="CaptionedFigure"/>
+      </w:pPr>
+      <w:r>
+        <w:drawing>
+          <wp:inline>
+            <wp:extent cx="4267200" cy="1833957"/>
+            <wp:effectExtent b="0" l="0" r="0" t="0"/>
+            <wp:docPr descr="" title="" id="41" name="Picture"/>
+            <a:graphic>
+              <a:graphicData uri="http://schemas.openxmlformats.org/drawingml/2006/picture">
+                <pic:pic>
+                  <pic:nvPicPr>
+                    <pic:cNvPr descr="figures/irs_Imagem1.png" id="42" name="Picture"/>
+                    <pic:cNvPicPr>
+                      <a:picLocks noChangeArrowheads="1" noChangeAspect="1"/>
+                    </pic:cNvPicPr>
+                  </pic:nvPicPr>
+                  <pic:blipFill>
+                    <a:blip r:embed="rId40"/>
+                    <a:stretch>
+                      <a:fillRect/>
+                    </a:stretch>
+                  </pic:blipFill>
+                  <pic:spPr bwMode="auto">
+                    <a:xfrm>
+                      <a:off x="0" y="0"/>
+                      <a:ext cx="4267200" cy="1833957"/>
+                    </a:xfrm>
+                    <a:prstGeom prst="rect">
+                      <a:avLst/>
+                    </a:prstGeom>
+                    <a:noFill/>
+                    <a:ln w="9525">
+                      <a:noFill/>
+                      <a:headEnd/>
+                      <a:tailEnd/>
+                    </a:ln>
+                  </pic:spPr>
+                </pic:pic>
+              </a:graphicData>
+            </a:graphic>
+          </wp:inline>
+        </w:drawing>
+      </w:r>
+    </w:p>
+    <w:p>
+      <w:pPr>
+        <w:pStyle w:val="ImageCaption"/>
+      </w:pPr>
+      <w:r>
+        <w:t xml:space="preserve">Distribuição do IRS.</w:t>
+      </w:r>
+    </w:p>
+    <w:bookmarkEnd w:id="43"/>
+    <w:p>
+      <w:pPr>
+        <w:pStyle w:val="BodyText"/>
+      </w:pPr>
+      <w:r>
+        <w:t xml:space="preserve">Os resultados se distribuíram em apenas metade do espaço total, com nenhum parlamentar tendo um escore superior a 0.5 no índice. Dentro desse espaço já reduzido, houve uma enorme concentração: 93,87% dos deputados (n = 460) receberam escores entre 0.05 e 0.2. Encontra-se um cenário parecido, porém mais intenso quanto à concentração dos dados, quando analisamos os resultados da mediana: A mediana dos resultados de quase todo o universo se concentrou entre 0.0 e 0.02.</w:t>
+      </w:r>
+    </w:p>
+    <w:bookmarkStart w:id="47" w:name="fig:irs_median_distribution"/>
+    <w:p>
+      <w:pPr>
+        <w:pStyle w:val="CaptionedFigure"/>
+      </w:pPr>
+      <w:r>
+        <w:drawing>
+          <wp:inline>
+            <wp:extent cx="4267200" cy="2115549"/>
+            <wp:effectExtent b="0" l="0" r="0" t="0"/>
+            <wp:docPr descr="" title="" id="45" name="Picture"/>
+            <a:graphic>
+              <a:graphicData uri="http://schemas.openxmlformats.org/drawingml/2006/picture">
+                <pic:pic>
+                  <pic:nvPicPr>
+                    <pic:cNvPr descr="figures/irs_Imagem2.png" id="46" name="Picture"/>
+                    <pic:cNvPicPr>
+                      <a:picLocks noChangeArrowheads="1" noChangeAspect="1"/>
+                    </pic:cNvPicPr>
+                  </pic:nvPicPr>
+                  <pic:blipFill>
+                    <a:blip r:embed="rId44"/>
+                    <a:stretch>
+                      <a:fillRect/>
+                    </a:stretch>
+                  </pic:blipFill>
+                  <pic:spPr bwMode="auto">
+                    <a:xfrm>
+                      <a:off x="0" y="0"/>
+                      <a:ext cx="4267200" cy="2115549"/>
+                    </a:xfrm>
+                    <a:prstGeom prst="rect">
+                      <a:avLst/>
+                    </a:prstGeom>
+                    <a:noFill/>
+                    <a:ln w="9525">
+                      <a:noFill/>
+                      <a:headEnd/>
+                      <a:tailEnd/>
+                    </a:ln>
+                  </pic:spPr>
+                </pic:pic>
+              </a:graphicData>
+            </a:graphic>
+          </wp:inline>
+        </w:drawing>
+      </w:r>
+    </w:p>
+    <w:p>
+      <w:pPr>
+        <w:pStyle w:val="ImageCaption"/>
+      </w:pPr>
+      <w:r>
+        <w:t xml:space="preserve">Distribuição do IRS.</w:t>
+      </w:r>
+    </w:p>
+    <w:bookmarkEnd w:id="47"/>
+    <w:p>
+      <w:pPr>
+        <w:pStyle w:val="BodyText"/>
+      </w:pPr>
+      <w:r>
+        <w:t xml:space="preserve">Portanto, cremos que os resultados precisam ser normalizados de alguma forma. A ideia inicial é que o cálculo da LSA pode estar sendo influenciado pela variedade do volume de postagens dos parlamentares: 17,75% (n = 87) dos deputados concentram 44,6% das postagens (n = 136.759). Por mais que os escores médios não difiram muito entre os grupos, 0.096 e 0.098, apostamos que uma normalização anterior ao cálculo poderia tornar os resultados mais acurados.</w:t>
+      </w:r>
+    </w:p>
+    <w:p>
+      <w:pPr>
+        <w:pStyle w:val="BodyText"/>
+      </w:pPr>
+      <w:r>
+        <w:t xml:space="preserve">Em resumo, o que preocupa é que, em meio a uma variedade grande de estratégias de comunicação e bases eleitorais dos deputados, os valores de coesão interna, além de estarem situados nas parcelas mais baixas do escore, se distribuem de maneira extremamente concentrada.</w:t>
+      </w:r>
+    </w:p>
+    <w:bookmarkEnd w:id="48"/>
+    <w:bookmarkEnd w:id="49"/>
+    <w:bookmarkStart w:id="52" w:name="índice-de-falar-sincero-ifs"/>
     <w:p>
       <w:pPr>
         <w:pStyle w:val="Heading1"/>
@@ -5712,7 +6033,7 @@
         <w:t xml:space="preserve">o conteúdo.</w:t>
       </w:r>
     </w:p>
-    <w:bookmarkStart w:id="40" w:name="definição-operacional-e-pontuação"/>
+    <w:bookmarkStart w:id="50" w:name="definição-operacional-e-pontuação"/>
     <w:p>
       <w:pPr>
         <w:pStyle w:val="Heading2"/>
@@ -6608,8 +6929,8 @@
         </m:oMath>
       </m:oMathPara>
     </w:p>
-    <w:bookmarkEnd w:id="40"/>
-    <w:bookmarkStart w:id="41" w:name="desafios-metodológicos"/>
+    <w:bookmarkEnd w:id="50"/>
+    <w:bookmarkStart w:id="51" w:name="desafios-metodológicos"/>
     <w:p>
       <w:pPr>
         <w:pStyle w:val="Heading2"/>
@@ -6751,9 +7072,9 @@
         <w:t xml:space="preserve">: A qualidade do índice depende da representatividade e da atualização contínua do corpus de referência, que deve abranger diferentes temas e períodos.</w:t>
       </w:r>
     </w:p>
-    <w:bookmarkEnd w:id="41"/>
-    <w:bookmarkEnd w:id="42"/>
-    <w:bookmarkStart w:id="45" w:name="appendix:ird"/>
+    <w:bookmarkEnd w:id="51"/>
+    <w:bookmarkEnd w:id="52"/>
+    <w:bookmarkStart w:id="55" w:name="appendix:ird"/>
     <w:p>
       <w:pPr>
         <w:pStyle w:val="Heading1"/>
@@ -7027,7 +7348,7 @@
         </m:oMath>
       </m:oMathPara>
     </w:p>
-    <w:bookmarkStart w:id="43" w:name="limites-de-d"/>
+    <w:bookmarkStart w:id="53" w:name="limites-de-d"/>
     <w:p>
       <w:pPr>
         <w:pStyle w:val="Heading2"/>
@@ -7723,8 +8044,8 @@
         </m:oMath>
       </m:oMathPara>
     </w:p>
-    <w:bookmarkEnd w:id="43"/>
-    <w:bookmarkStart w:id="44" w:name="normalização-e-definição-do-índice-ird"/>
+    <w:bookmarkEnd w:id="53"/>
+    <w:bookmarkStart w:id="54" w:name="normalização-e-definição-do-índice-ird"/>
     <w:p>
       <w:pPr>
         <w:pStyle w:val="Heading2"/>
@@ -8350,8 +8671,8 @@
         <w:t xml:space="preserve">refletem forte desequilíbrio.</w:t>
       </w:r>
     </w:p>
-    <w:bookmarkEnd w:id="44"/>
-    <w:bookmarkEnd w:id="45"/>
+    <w:bookmarkEnd w:id="54"/>
+    <w:bookmarkEnd w:id="55"/>
     <w:sectPr>
       <w:footnotePr>
         <w:numRestart w:val="eachSect"/>

</xml_diff>